<commit_message>
Revisions on the Water paper
</commit_message>
<xml_diff>
--- a/doc/review/Recenzije.docx
+++ b/doc/review/Recenzije.docx
@@ -6,12 +6,23 @@
       <w:pPr>
         <w:pStyle w:val="Normal"/>
         <w:rPr>
-          <w:color w:val="EE0000"/>
-        </w:rPr>
-      </w:pPr>
-      <w:r>
-        <w:rPr>
-          <w:color w:val="EE0000"/>
+          <w:b/>
+          <w:b/>
+          <w:bCs/>
+          <w:color w:val="000000"/>
+          <w:sz w:val="28"/>
+          <w:szCs w:val="28"/>
+          <w:u w:val="single"/>
+        </w:rPr>
+      </w:pPr>
+      <w:r>
+        <w:rPr>
+          <w:b/>
+          <w:bCs/>
+          <w:color w:val="000000"/>
+          <w:sz w:val="28"/>
+          <w:szCs w:val="28"/>
+          <w:u w:val="single"/>
         </w:rPr>
         <w:t>Reviewer 1</w:t>
       </w:r>
@@ -20,12 +31,12 @@
       <w:pPr>
         <w:pStyle w:val="Normal"/>
         <w:rPr>
-          <w:color w:val="EE0000"/>
-        </w:rPr>
-      </w:pPr>
-      <w:r>
-        <w:rPr>
-          <w:color w:val="EE0000"/>
+          <w:color w:val="000000"/>
+        </w:rPr>
+      </w:pPr>
+      <w:r>
+        <w:rPr>
+          <w:color w:val="000000"/>
         </w:rPr>
         <w:t>This manuscript addresses an important topic: applying machine-learning methods to monthly streamflow forecasting in the Bosna River Basin. RF, XGBoost, and LSTM are used for this task. However, the paper needs clearer explanations and a stronger original methodology to be accepted. The main problem with the paper is that its only original contribution is that these methods are applied to another river. If this is acceptable for the redaction on Water as the case study, I am not sure.</w:t>
       </w:r>
@@ -108,7 +119,17 @@
       </w:r>
       <w:r>
         <w:rPr/>
-        <w:t xml:space="preserve">. TODO </w:t>
+        <w:t xml:space="preserve">. </w:t>
+      </w:r>
+      <w:r>
+        <w:rPr>
+          <w:color w:val="FF0000"/>
+        </w:rPr>
+        <w:t>TODO</w:t>
+      </w:r>
+      <w:r>
+        <w:rPr/>
+        <w:t xml:space="preserve"> </w:t>
       </w:r>
     </w:p>
     <w:p>
@@ -157,7 +178,17 @@
       </w:r>
       <w:r>
         <w:rPr/>
-        <w:t xml:space="preserve">. We agree that time resolution could affect how model perform. However, most of these climate data that cover 50 and more years for many countries in the world are hardly to get or imposible to get. This is also the case of Bosnia and Herzegovina. On the other hand, many papers from this field deal with the same aggregations (monthly aggregated observations are pretty the standard). We refer to several papers that uses the same: XX, XX, … </w:t>
+        <w:t xml:space="preserve">. </w:t>
+      </w:r>
+      <w:r>
+        <w:rPr>
+          <w:color w:val="FF0000"/>
+        </w:rPr>
+        <w:t>We agree that time resolution could affect how model perform. However, most of these climate data that cover 50 and more years for many countries in the world are hardly to get or imposible to get. This is also the case of Bosnia and Herzegovina. On the other hand, many papers from this field deal with the same aggregations (monthly aggregated observations are pretty the standard). We refer to several papers that uses the same: XX, XX, …</w:t>
+      </w:r>
+      <w:r>
+        <w:rPr/>
+        <w:t xml:space="preserve"> </w:t>
       </w:r>
     </w:p>
     <w:p>
@@ -221,6 +252,7 @@
         <w:rPr>
           <w:b w:val="false"/>
           <w:bCs w:val="false"/>
+          <w:color w:val="FF0000"/>
         </w:rPr>
         <w:t>A six-month data gap was identified in the temperature records for the Zenica station (July–December 2017). This gap was addressed by imputing missing values using the climatological monthly mean, computed from all available years for each corresponding calendar month. This approach was selected for two main reasons. First, the missing period is relatively short (six consecutive months) compared to the full observation period (1961–2020), making climatological averaging a stable and robust estimate. Second, monthly aggregation reduces short-term variability, and thus climatological means provide a reasonable approximation of expected seasonal conditions without introducing artificial extremes or noise.</w:t>
       </w:r>
@@ -232,12 +264,14 @@
           <w:b w:val="false"/>
           <w:b w:val="false"/>
           <w:bCs w:val="false"/>
+          <w:color w:val="FF0000"/>
         </w:rPr>
       </w:pPr>
       <w:r>
         <w:rPr>
           <w:b w:val="false"/>
           <w:bCs w:val="false"/>
+          <w:color w:val="FF0000"/>
         </w:rPr>
       </w:r>
     </w:p>
@@ -248,12 +282,14 @@
           <w:b w:val="false"/>
           <w:b w:val="false"/>
           <w:bCs w:val="false"/>
+          <w:color w:val="FF0000"/>
         </w:rPr>
       </w:pPr>
       <w:r>
         <w:rPr>
           <w:b w:val="false"/>
           <w:bCs w:val="false"/>
+          <w:color w:val="FF0000"/>
         </w:rPr>
         <w:t xml:space="preserve">The imputation procedure is implemented as follows: for each missing month, the long-term average temperature for that specific calendar month (e.g., July mean over all years) was assigned. This ensures that the seasonal structure of the data is preserved. No additional missing values were identified in the remaining meteorological or hydrological variables after merging the datasets. Therefore, this was the only instance where explicit gap-filling was required. </w:t>
       </w:r>
@@ -265,12 +301,14 @@
           <w:b w:val="false"/>
           <w:b w:val="false"/>
           <w:bCs w:val="false"/>
+          <w:color w:val="FF0000"/>
         </w:rPr>
       </w:pPr>
       <w:r>
         <w:rPr>
           <w:b w:val="false"/>
           <w:bCs w:val="false"/>
+          <w:color w:val="FF0000"/>
         </w:rPr>
         <w:t>Regarding lagged features, the introduction of temporal lags (up to three months for precipitation and one month for discharge) naturally produces missing values at the beginning of the time series. These records were removed prior to model training using a complete-case approach (i.e., rows containing \texttt{NaN} values were dropped).</w:t>
       </w:r>
@@ -299,12 +337,14 @@
           <w:b w:val="false"/>
           <w:b w:val="false"/>
           <w:bCs w:val="false"/>
+          <w:color w:val="FF0000"/>
         </w:rPr>
       </w:pPr>
       <w:r>
         <w:rPr>
           <w:b w:val="false"/>
           <w:bCs w:val="false"/>
+          <w:color w:val="FF0000"/>
         </w:rPr>
         <w:t>Given the maximum lag of three months, a total of three initial observations were removed from the dataset. This reduction is negligible relative to the full dataset size (approximately 720 monthly records) and is not expected to affect model training or evaluation. The potential impact of the Zenica imputation on model performance is considered limited. Since the imputed values correspond to climatological averages, they do not introduce artificial variability or extreme events, and thus primarily affect only a small portion of the training data. Furthermore, the use of ensemble models (Random Forest and XGBoost), which are robust to small perturbations in input data, mitigates the influence of such localized imputations.</w:t>
       </w:r>
@@ -318,171 +358,136 @@
           <w:b w:val="false"/>
           <w:b w:val="false"/>
           <w:bCs w:val="false"/>
+          <w:color w:val="FF0000"/>
         </w:rPr>
       </w:pPr>
       <w:r>
         <w:rPr>
           <w:b w:val="false"/>
           <w:bCs w:val="false"/>
+          <w:color w:val="FF0000"/>
+        </w:rPr>
+        <w:t xml:space="preserve">    </w:t>
+      </w:r>
+    </w:p>
+    <w:p>
+      <w:pPr>
+        <w:pStyle w:val="ListParagraph"/>
+        <w:jc w:val="both"/>
+        <w:rPr/>
+      </w:pPr>
+      <w:r>
+        <w:rPr/>
+      </w:r>
+    </w:p>
+    <w:p>
+      <w:pPr>
+        <w:pStyle w:val="ListParagraph"/>
+        <w:numPr>
+          <w:ilvl w:val="0"/>
+          <w:numId w:val="1"/>
+        </w:numPr>
+        <w:rPr/>
+      </w:pPr>
+      <w:r>
+        <w:rPr/>
+        <w:t>The predictors include only previous precipitation, temperature, and one lagged discharge term. Since the study uses monthly data, the authors should consider whether seasonality indicators, snow-related variables, and other hydrologically relevant factors would not be useful. The feature set seems limited, and the choice is not well explained.</w:t>
+      </w:r>
+    </w:p>
+    <w:p>
+      <w:pPr>
+        <w:pStyle w:val="ListParagraph"/>
+        <w:numPr>
+          <w:ilvl w:val="0"/>
+          <w:numId w:val="0"/>
+        </w:numPr>
+        <w:ind w:left="720" w:hanging="0"/>
+        <w:rPr/>
+      </w:pPr>
+      <w:r>
+        <w:rPr>
+          <w:b/>
+          <w:bCs/>
+        </w:rPr>
+        <w:t>Answer.</w:t>
+      </w:r>
+      <w:r>
+        <w:rPr/>
+        <w:t xml:space="preserve">   </w:t>
+      </w:r>
+      <w:r>
+        <w:rPr>
+          <w:color w:val="FF0000"/>
+        </w:rPr>
+        <w:t>We thank the reviewer for this insightful comment regarding the selection of predictor variables. The current study intentionally adopts a relatively compact feature set consisting of precipitation, temperature, and an autoregressive discharge term, augmented with lagged values. This choice was motivated by two considerations. First, the focus of the study is to evaluate the predictive capability of different modeling paradigms under a consistent and parsimonious set of hydro-meteorological inputs. By limiting the feature space, we aim to ensure a fair comparison between models and to avoid introducing additional sources of uncertainty related to feature engineering. Second, the availability and reliability of long-term data (1961–2020) impose practical constraints. While additional predictors such as snow water equivalent, snowmelt indices, soil moisture, or large-scale climate indices (e.g., NAO) could potentially improve predictive performance, such variables are not consistently available for the entire study period and basin. Seasonality effects are implicitly captured through the inclusion of lagged variables and the strong annual cycle present in temperature and precipitation time series. In addition, the autoregressive discharge term ($Q_{t-1}$) provides a proxy for antecedent hydrological conditions, including storage and delayed runoff processes.</w:t>
+      </w:r>
+    </w:p>
+    <w:p>
+      <w:pPr>
+        <w:pStyle w:val="ListParagraph"/>
+        <w:numPr>
+          <w:ilvl w:val="0"/>
+          <w:numId w:val="0"/>
+        </w:numPr>
+        <w:ind w:left="720" w:hanging="0"/>
+        <w:rPr>
+          <w:color w:val="FF0000"/>
+        </w:rPr>
+      </w:pPr>
+      <w:r>
+        <w:rPr>
+          <w:color w:val="FF0000"/>
+        </w:rPr>
+        <w:t>We agree that incorporating additional hydrologically relevant predictors, particularly snow-related variables for mountainous subregions of the basin (e.g., Bjelašnica), could further enhance model performance. This will be considered as an important direction for future work.</w:t>
+      </w:r>
+    </w:p>
+    <w:p>
+      <w:pPr>
+        <w:pStyle w:val="ListParagraph"/>
+        <w:numPr>
+          <w:ilvl w:val="0"/>
+          <w:numId w:val="0"/>
+        </w:numPr>
+        <w:ind w:hanging="0"/>
+        <w:rPr>
+          <w:color w:val="FF0000"/>
+        </w:rPr>
+      </w:pPr>
+      <w:r>
+        <w:rPr>
+          <w:color w:val="FF0000"/>
         </w:rPr>
         <w:t xml:space="preserve">         </w:t>
       </w:r>
       <w:r>
         <w:rPr>
-          <w:b w:val="false"/>
-          <w:bCs w:val="false"/>
-        </w:rPr>
-        <w:t xml:space="preserve">Overall, the adopted strategy ensures data completeness while  </w:t>
-      </w:r>
-    </w:p>
-    <w:p>
-      <w:pPr>
-        <w:pStyle w:val="ListParagraph"/>
+          <w:color w:val="FF0000"/>
+        </w:rPr>
+        <w:t xml:space="preserve">To clarify this aspect, the manuscript has been revised to explicitly </w:t>
+      </w:r>
+    </w:p>
+    <w:p>
+      <w:pPr>
+        <w:pStyle w:val="ListParagraph"/>
+        <w:numPr>
+          <w:ilvl w:val="0"/>
+          <w:numId w:val="0"/>
+        </w:numPr>
         <w:ind w:hanging="0"/>
-        <w:jc w:val="both"/>
-        <w:rPr>
-          <w:b w:val="false"/>
-          <w:b w:val="false"/>
-          <w:bCs w:val="false"/>
-        </w:rPr>
-      </w:pPr>
-      <w:r>
-        <w:rPr>
-          <w:b w:val="false"/>
-          <w:bCs w:val="false"/>
+        <w:rPr>
+          <w:color w:val="FF0000"/>
+        </w:rPr>
+      </w:pPr>
+      <w:r>
+        <w:rPr>
+          <w:color w:val="FF0000"/>
         </w:rPr>
         <w:t xml:space="preserve">         </w:t>
       </w:r>
       <w:r>
         <w:rPr>
-          <w:b w:val="false"/>
-          <w:bCs w:val="false"/>
-        </w:rPr>
-        <w:t>preserving the statistical and seasonal characteristics of the hydro-</w:t>
-      </w:r>
-    </w:p>
-    <w:p>
-      <w:pPr>
-        <w:pStyle w:val="ListParagraph"/>
-        <w:ind w:hanging="0"/>
-        <w:jc w:val="both"/>
-        <w:rPr>
-          <w:b w:val="false"/>
-          <w:b w:val="false"/>
-          <w:bCs w:val="false"/>
-        </w:rPr>
-      </w:pPr>
-      <w:r>
-        <w:rPr>
-          <w:b w:val="false"/>
-          <w:bCs w:val="false"/>
-        </w:rPr>
-        <w:t xml:space="preserve">         </w:t>
-      </w:r>
-      <w:r>
-        <w:rPr>
-          <w:b w:val="false"/>
-          <w:bCs w:val="false"/>
-        </w:rPr>
-        <w:t>meteorological time series.</w:t>
-      </w:r>
-    </w:p>
-    <w:p>
-      <w:pPr>
-        <w:pStyle w:val="ListParagraph"/>
-        <w:jc w:val="both"/>
-        <w:rPr/>
-      </w:pPr>
-      <w:r>
-        <w:rPr/>
-      </w:r>
-    </w:p>
-    <w:p>
-      <w:pPr>
-        <w:pStyle w:val="ListParagraph"/>
-        <w:numPr>
-          <w:ilvl w:val="0"/>
-          <w:numId w:val="1"/>
-        </w:numPr>
-        <w:rPr/>
-      </w:pPr>
-      <w:r>
-        <w:rPr/>
-        <w:t>The predictors include only previous precipitation, temperature, and one lagged discharge term. Since the study uses monthly data, the authors should consider whether seasonality indicators, snow-related variables, and other hydrologically relevant factors would not be useful. The feature set seems limited, and the choice is not well explained.</w:t>
-      </w:r>
-    </w:p>
-    <w:p>
-      <w:pPr>
-        <w:pStyle w:val="ListParagraph"/>
-        <w:numPr>
-          <w:ilvl w:val="0"/>
-          <w:numId w:val="0"/>
-        </w:numPr>
-        <w:ind w:left="720" w:hanging="0"/>
-        <w:rPr/>
-      </w:pPr>
-      <w:r>
-        <w:rPr>
-          <w:b/>
-          <w:bCs/>
-        </w:rPr>
-        <w:t>Answer.</w:t>
-      </w:r>
-      <w:r>
-        <w:rPr/>
-        <w:t xml:space="preserve">   We thank the reviewer for this insightful comment regarding the selection of predictor variables. The current study intentionally adopts a relatively compact feature set consisting of precipitation, temperature, and an autoregressive discharge term, augmented with lagged values. This choice was motivated by two considerations. First, the focus of the study is to evaluate the predictive capability of different modeling paradigms under a consistent and parsimonious set of hydro-meteorological inputs. By limiting the feature space, we aim to ensure a fair comparison between models and to avoid introducing additional sources of uncertainty related to feature engineering. Second, the availability and reliability of long-term data (1961–2020) impose practical constraints. While additional predictors such as snow water equivalent, snowmelt indices, soil moisture, or large-scale climate indices (e.g., NAO) could potentially improve predictive performance, such variables are not consistently available for the entire study period and basin. Seasonality effects are implicitly captured through the inclusion of lagged variables and the strong annual cycle present in temperature and precipitation time series. In addition, the autoregressive discharge term ($Q_{t-1}$) provides a proxy for antecedent hydrological conditions, including storage and delayed runoff processes.</w:t>
-      </w:r>
-    </w:p>
-    <w:p>
-      <w:pPr>
-        <w:pStyle w:val="ListParagraph"/>
-        <w:numPr>
-          <w:ilvl w:val="0"/>
-          <w:numId w:val="0"/>
-        </w:numPr>
-        <w:ind w:left="720" w:hanging="0"/>
-        <w:rPr/>
-      </w:pPr>
-      <w:r>
-        <w:rPr/>
-        <w:t>We agree that incorporating additional hydrologically relevant predictors, particularly snow-related variables for mountainous subregions of the basin (e.g., Bjelašnica), could further enhance model performance. This will be considered as an important direction for future work.</w:t>
-      </w:r>
-    </w:p>
-    <w:p>
-      <w:pPr>
-        <w:pStyle w:val="ListParagraph"/>
-        <w:numPr>
-          <w:ilvl w:val="0"/>
-          <w:numId w:val="0"/>
-        </w:numPr>
-        <w:ind w:hanging="0"/>
-        <w:rPr/>
-      </w:pPr>
-      <w:r>
-        <w:rPr/>
-        <w:t xml:space="preserve">         </w:t>
-      </w:r>
-      <w:r>
-        <w:rPr/>
-        <w:t xml:space="preserve">To clarify this aspect, the manuscript has been revised to explicitly </w:t>
-      </w:r>
-    </w:p>
-    <w:p>
-      <w:pPr>
-        <w:pStyle w:val="ListParagraph"/>
-        <w:numPr>
-          <w:ilvl w:val="0"/>
-          <w:numId w:val="0"/>
-        </w:numPr>
-        <w:ind w:hanging="0"/>
-        <w:rPr/>
-      </w:pPr>
-      <w:r>
-        <w:rPr/>
-        <w:t xml:space="preserve">         </w:t>
-      </w:r>
-      <w:r>
-        <w:rPr/>
+          <w:color w:val="FF0000"/>
+        </w:rPr>
         <w:t xml:space="preserve">mention this in Future work section by adding the sentence: </w:t>
         <w:tab/>
         <w:tab/>
@@ -492,6 +497,7 @@
         <w:rPr>
           <w:i/>
           <w:iCs/>
+          <w:color w:val="FF0000"/>
         </w:rPr>
         <w:t xml:space="preserve">he absence of explicit seasonality indicators (e.g., </w:t>
         <w:tab/>
@@ -506,7 +512,9 @@
         <w:t>assessing their impact on predictive performance.</w:t>
       </w:r>
       <w:r>
-        <w:rPr/>
+        <w:rPr>
+          <w:color w:val="FF0000"/>
+        </w:rPr>
         <w:t>”</w:t>
       </w:r>
     </w:p>
@@ -518,10 +526,14 @@
           <w:numId w:val="0"/>
         </w:numPr>
         <w:ind w:hanging="0"/>
-        <w:rPr/>
-      </w:pPr>
-      <w:r>
-        <w:rPr/>
+        <w:rPr>
+          <w:color w:val="FF0000"/>
+        </w:rPr>
+      </w:pPr>
+      <w:r>
+        <w:rPr>
+          <w:color w:val="FF0000"/>
+        </w:rPr>
         <w:t xml:space="preserve">          </w:t>
       </w:r>
     </w:p>
@@ -533,10 +545,14 @@
           <w:numId w:val="0"/>
         </w:numPr>
         <w:ind w:left="720" w:hanging="0"/>
-        <w:rPr/>
-      </w:pPr>
-      <w:r>
-        <w:rPr/>
+        <w:rPr>
+          <w:color w:val="FF0000"/>
+        </w:rPr>
+      </w:pPr>
+      <w:r>
+        <w:rPr>
+          <w:color w:val="FF0000"/>
+        </w:rPr>
       </w:r>
     </w:p>
     <w:p>
@@ -546,10 +562,14 @@
           <w:ilvl w:val="0"/>
           <w:numId w:val="1"/>
         </w:numPr>
-        <w:rPr/>
-      </w:pPr>
-      <w:r>
-        <w:rPr/>
+        <w:rPr>
+          <w:color w:val="000000"/>
+        </w:rPr>
+      </w:pPr>
+      <w:r>
+        <w:rPr>
+          <w:color w:val="000000"/>
+        </w:rPr>
         <w:t>The manuscript should clearly state which software and packages were used for RF, XGBoost, LSTM, cross-validation, and feature-importance analysis. This information is missing and important for others to reproduce the results.</w:t>
       </w:r>
     </w:p>
@@ -562,15 +582,35 @@
         </w:numPr>
         <w:ind w:left="720" w:hanging="0"/>
         <w:rPr>
+          <w:color w:val="000000"/>
+        </w:rPr>
+      </w:pPr>
+      <w:r>
+        <w:rPr>
+          <w:color w:val="000000"/>
+        </w:rPr>
+      </w:r>
+    </w:p>
+    <w:p>
+      <w:pPr>
+        <w:pStyle w:val="ListParagraph"/>
+        <w:numPr>
+          <w:ilvl w:val="0"/>
+          <w:numId w:val="0"/>
+        </w:numPr>
+        <w:ind w:left="720" w:hanging="0"/>
+        <w:rPr>
           <w:b/>
           <w:b/>
           <w:bCs/>
+          <w:color w:val="FF0000"/>
         </w:rPr>
       </w:pPr>
       <w:r>
         <w:rPr>
           <w:b/>
           <w:bCs/>
+          <w:color w:val="FF0000"/>
         </w:rPr>
         <w:t xml:space="preserve">Answer. </w:t>
       </w:r>
@@ -578,6 +618,7 @@
         <w:rPr>
           <w:b w:val="false"/>
           <w:bCs w:val="false"/>
+          <w:color w:val="FF0000"/>
         </w:rPr>
         <w:t xml:space="preserve">We thank the reviewer for highlighting the importance of reproducibility. The manuscript has been revised to explicitly state the software environment and libraries used for model development, training, and evaluation. All experiments were implemented in Python using widely adopted open-source libraries. Specifically, XGBoost was implemented using the </w:t>
       </w:r>
@@ -587,6 +628,7 @@
           <w:bCs w:val="false"/>
           <w:i/>
           <w:iCs/>
+          <w:color w:val="FF0000"/>
         </w:rPr>
         <w:t>xgboost</w:t>
       </w:r>
@@ -594,6 +636,7 @@
         <w:rPr>
           <w:b w:val="false"/>
           <w:bCs w:val="false"/>
+          <w:color w:val="FF0000"/>
         </w:rPr>
         <w:t xml:space="preserve"> library, Random Forest using </w:t>
       </w:r>
@@ -603,6 +646,7 @@
           <w:bCs w:val="false"/>
           <w:i/>
           <w:iCs/>
+          <w:color w:val="FF0000"/>
         </w:rPr>
         <w:t>scikit-learn</w:t>
       </w:r>
@@ -610,6 +654,7 @@
         <w:rPr>
           <w:b w:val="false"/>
           <w:bCs w:val="false"/>
+          <w:color w:val="FF0000"/>
         </w:rPr>
         <w:t xml:space="preserve">, and LSTM models using </w:t>
       </w:r>
@@ -619,6 +664,7 @@
           <w:bCs w:val="false"/>
           <w:i/>
           <w:iCs/>
+          <w:color w:val="FF0000"/>
         </w:rPr>
         <w:t>TensorFlow/Keras</w:t>
       </w:r>
@@ -626,6 +672,7 @@
         <w:rPr>
           <w:b w:val="false"/>
           <w:bCs w:val="false"/>
+          <w:color w:val="FF0000"/>
         </w:rPr>
         <w:t xml:space="preserve">. Time-series cross-validation and hyperparameter tuning were conducted using  </w:t>
       </w:r>
@@ -635,6 +682,7 @@
           <w:bCs w:val="false"/>
           <w:i/>
           <w:iCs/>
+          <w:color w:val="FF0000"/>
         </w:rPr>
         <w:t>scikit-learn</w:t>
       </w:r>
@@ -642,6 +690,7 @@
         <w:rPr>
           <w:b w:val="false"/>
           <w:bCs w:val="false"/>
+          <w:color w:val="FF0000"/>
         </w:rPr>
         <w:t>, while feature importance analysis was performed using model-based importance measures and permutation</w:t>
       </w:r>
@@ -649,6 +698,7 @@
         <w:rPr>
           <w:b/>
           <w:bCs/>
+          <w:color w:val="FF0000"/>
         </w:rPr>
         <w:t xml:space="preserve"> </w:t>
       </w:r>
@@ -656,6 +706,7 @@
         <w:rPr>
           <w:b w:val="false"/>
           <w:bCs w:val="false"/>
+          <w:color w:val="FF0000"/>
         </w:rPr>
         <w:t>importance</w:t>
       </w:r>
@@ -663,6 +714,7 @@
         <w:rPr>
           <w:b/>
           <w:bCs/>
+          <w:color w:val="FF0000"/>
         </w:rPr>
         <w:t xml:space="preserve"> </w:t>
       </w:r>
@@ -670,6 +722,7 @@
         <w:rPr>
           <w:b w:val="false"/>
           <w:bCs w:val="false"/>
+          <w:color w:val="FF0000"/>
         </w:rPr>
         <w:t xml:space="preserve">techniques. These details have now been included in a dedicated subsection in the revised manuscript; please consult Section 2.3. </w:t>
       </w:r>
@@ -713,6 +766,20 @@
         <w:rPr/>
       </w:pPr>
       <w:r>
+        <w:rPr/>
+      </w:r>
+    </w:p>
+    <w:p>
+      <w:pPr>
+        <w:pStyle w:val="ListParagraph"/>
+        <w:numPr>
+          <w:ilvl w:val="0"/>
+          <w:numId w:val="0"/>
+        </w:numPr>
+        <w:ind w:left="720" w:hanging="0"/>
+        <w:rPr/>
+      </w:pPr>
+      <w:r>
         <w:rPr>
           <w:b/>
           <w:bCs/>
@@ -721,16 +788,26 @@
       </w:r>
       <w:r>
         <w:rPr/>
-        <w:t>.  We thank the reviewer for this important comment. We agree that, while an NSE value of approximately 0.59 indicates reasonable predictive skill at the monthly scale, it does not necessarily guarantee reliable performance for all hydrological applications. In the revised manuscript, we have expanded the discussion to explicitly address the limitations of the proposed models, particularly in relation to extreme flow conditions and operational applicability.   We clarify that the presented models are primarily suited for capturing general discharge dynamics and seasonal variability, rather than precise prediction of extreme events. These limitations, along with implications for practical use, are now discussed in detail in the revised manuscript.</w:t>
-      </w:r>
-    </w:p>
-    <w:p>
-      <w:pPr>
-        <w:pStyle w:val="ListParagraph"/>
-        <w:rPr/>
-      </w:pPr>
-      <w:r>
-        <w:rPr/>
+        <w:t xml:space="preserve">. </w:t>
+      </w:r>
+      <w:r>
+        <w:rPr>
+          <w:color w:val="FF0000"/>
+        </w:rPr>
+        <w:t xml:space="preserve"> We thank the reviewer for this important comment. We agree that, while an NSE value of approximately 0.59 indicates reasonable predictive skill at the monthly scale, it does not necessarily guarantee reliable performance for all hydrological applications. In the revised manuscript, we have expanded the discussion to explicitly address the limitations of the proposed models, particularly in relation to extreme flow conditions and operational applicability.   We clarify that the presented models are primarily suited for capturing general discharge dynamics and seasonal variability, rather than precise prediction of extreme events. These limitations, along with implications for practical use, are now discussed in detail in the revised manuscript.</w:t>
+      </w:r>
+    </w:p>
+    <w:p>
+      <w:pPr>
+        <w:pStyle w:val="ListParagraph"/>
+        <w:rPr>
+          <w:color w:val="FF0000"/>
+        </w:rPr>
+      </w:pPr>
+      <w:r>
+        <w:rPr>
+          <w:color w:val="FF0000"/>
+        </w:rPr>
       </w:r>
     </w:p>
     <w:p>
@@ -766,7 +843,13 @@
       </w:r>
       <w:r>
         <w:rPr/>
-        <w:t>.   TODO the task regarding Figure 2 left to Igor</w:t>
+        <w:t xml:space="preserve">.   </w:t>
+      </w:r>
+      <w:r>
+        <w:rPr>
+          <w:color w:val="FF0000"/>
+        </w:rPr>
+        <w:t>TODO the task regarding Figure 2 left to Igor</w:t>
       </w:r>
     </w:p>
     <w:p>
@@ -816,7 +899,13 @@
       </w:r>
       <w:r>
         <w:rPr/>
-        <w:t>. TODO (Marko)</w:t>
+        <w:t xml:space="preserve">. </w:t>
+      </w:r>
+      <w:r>
+        <w:rPr>
+          <w:color w:val="FF0000"/>
+        </w:rPr>
+        <w:t>TODO (Marko)</w:t>
       </w:r>
     </w:p>
     <w:p>
@@ -866,7 +955,27 @@
       </w:r>
       <w:r>
         <w:rPr/>
-        <w:t xml:space="preserve">. This (should) has been deleted. </w:t>
+        <w:t xml:space="preserve">. </w:t>
+      </w:r>
+      <w:r>
+        <w:rPr>
+          <w:color w:val="FF0000"/>
+        </w:rPr>
+        <w:t xml:space="preserve">This is permanently deleted. It is included into separate document. </w:t>
+      </w:r>
+    </w:p>
+    <w:p>
+      <w:pPr>
+        <w:pStyle w:val="ListParagraph"/>
+        <w:numPr>
+          <w:ilvl w:val="0"/>
+          <w:numId w:val="0"/>
+        </w:numPr>
+        <w:ind w:hanging="0"/>
+        <w:rPr/>
+      </w:pPr>
+      <w:r>
+        <w:rPr/>
       </w:r>
     </w:p>
     <w:p>
@@ -882,319 +991,533 @@
       <w:pPr>
         <w:pStyle w:val="Normal"/>
         <w:rPr>
+          <w:b/>
+          <w:b/>
+          <w:bCs/>
+          <w:color w:val="111111"/>
+          <w:sz w:val="28"/>
+          <w:szCs w:val="28"/>
+          <w:u w:val="single"/>
+        </w:rPr>
+      </w:pPr>
+      <w:r>
+        <w:rPr>
+          <w:b/>
+          <w:bCs/>
+          <w:color w:val="111111"/>
+          <w:sz w:val="28"/>
+          <w:szCs w:val="28"/>
+          <w:u w:val="single"/>
+        </w:rPr>
+        <w:t>Reviewer 2</w:t>
+      </w:r>
+    </w:p>
+    <w:p>
+      <w:pPr>
+        <w:pStyle w:val="Normal"/>
+        <w:rPr>
+          <w:color w:val="000000" w:themeColor="text1"/>
+        </w:rPr>
+      </w:pPr>
+      <w:r>
+        <w:rPr>
+          <w:color w:val="000000" w:themeColor="text1"/>
+        </w:rPr>
+        <w:t>The manuscript presents an original application of machine learning (ML) techniques for streamflow forecasting in the Bosna River Basin, Bosnia and Herzegovina. The study compares Random Forest (RF), XGBoost, and Long Short-Term Memory (LSTM) models using a multi-decade dataset, highlighting the performance of tree-based ensemble methods over deep learning approaches. It further employs explainable AI (XAI) to interpret hydro-climatic predictors contributing to streamflow dynamics. The research is well-motivated and fills a gap in the regional literature.</w:t>
+      </w:r>
+    </w:p>
+    <w:p>
+      <w:pPr>
+        <w:pStyle w:val="Normal"/>
+        <w:rPr>
+          <w:color w:val="000000" w:themeColor="text1"/>
+        </w:rPr>
+      </w:pPr>
+      <w:r>
+        <w:rPr>
+          <w:color w:val="000000" w:themeColor="text1"/>
+        </w:rPr>
+      </w:r>
+    </w:p>
+    <w:p>
+      <w:pPr>
+        <w:pStyle w:val="Normal"/>
+        <w:rPr>
+          <w:color w:val="000000" w:themeColor="text1"/>
+        </w:rPr>
+      </w:pPr>
+      <w:r>
+        <w:rPr>
+          <w:color w:val="000000" w:themeColor="text1"/>
+        </w:rPr>
+        <w:t>However, there are several major concerns that prevent the acceptance of this paper at its status.</w:t>
+      </w:r>
+    </w:p>
+    <w:p>
+      <w:pPr>
+        <w:pStyle w:val="Normal"/>
+        <w:rPr>
+          <w:color w:val="000000" w:themeColor="text1"/>
+        </w:rPr>
+      </w:pPr>
+      <w:r>
+        <w:rPr>
+          <w:color w:val="000000" w:themeColor="text1"/>
+        </w:rPr>
+      </w:r>
+    </w:p>
+    <w:p>
+      <w:pPr>
+        <w:pStyle w:val="Normal"/>
+        <w:rPr>
+          <w:color w:val="000000" w:themeColor="text1"/>
+        </w:rPr>
+      </w:pPr>
+      <w:r>
+        <w:rPr>
+          <w:color w:val="000000" w:themeColor="text1"/>
+        </w:rPr>
+        <w:t>First and foremost, the use of monthly instead of daily streamflow data. While monthly streamflow forecasting is relevant for water resource planning and climate change studies, it is less relevant to short-term management such as operational flood forecasting, early warning systems etc. Monthly streamflow can not capture rapid hydrological events (e.g., flash floods, snowmelt pulses), peak flows, and more detailed hydrograph dynamics. More importantly, in terms of machine learning, choosing monthly streamflow significantly reduces the size of the training sample, which has important implications for model performance. Machine learning models, and especially deep learning models like LSTM, generally require large sample sizes to perform robustly and avoid overfitting or underfitting, which is reflected in the results: the manuscript shows that LSTM performed significantly worse than Random Forest and XGBoost. The performance gap between training and testing highlights non-stationarity and the challenge of extracting predictive skill from limited monthly samples.</w:t>
+      </w:r>
+    </w:p>
+    <w:p>
+      <w:pPr>
+        <w:pStyle w:val="Normal"/>
+        <w:rPr>
+          <w:color w:val="000000" w:themeColor="text1"/>
+        </w:rPr>
+      </w:pPr>
+      <w:r>
+        <w:rPr>
+          <w:b/>
+          <w:bCs/>
+          <w:color w:val="000000" w:themeColor="text1"/>
+        </w:rPr>
+        <w:t>Answer</w:t>
+      </w:r>
+      <w:r>
+        <w:rPr>
+          <w:color w:val="000000" w:themeColor="text1"/>
+        </w:rPr>
+        <w:t xml:space="preserve">. </w:t>
+      </w:r>
+      <w:r>
+        <w:rPr>
+          <w:color w:val="FF0000"/>
+        </w:rPr>
+        <w:t xml:space="preserve">Thank you the reviewer for pointing these clear facts. We are aware that the use of monthly aggregated streamflow data implies several potential drawbacks. First, we want to emphasize that we did obtain the data in these format this data keeping them untouched while performing the experiments. It still remains hard to get (complete) daily data for a long period, especially in less developed countries such as Bosnia and Herzegovina. Secondly, similar studies already published in this area uses monthly streamflow data (see XX, XX – provide a few references). </w:t>
+      </w:r>
+    </w:p>
+    <w:p>
+      <w:pPr>
+        <w:pStyle w:val="Normal"/>
+        <w:rPr>
+          <w:color w:val="000000" w:themeColor="text1"/>
+        </w:rPr>
+      </w:pPr>
+      <w:r>
+        <w:rPr/>
+      </w:r>
+    </w:p>
+    <w:p>
+      <w:pPr>
+        <w:pStyle w:val="Normal"/>
+        <w:rPr>
+          <w:color w:val="000000" w:themeColor="text1"/>
+        </w:rPr>
+      </w:pPr>
+      <w:r>
+        <w:rPr>
+          <w:color w:val="000000" w:themeColor="text1"/>
+        </w:rPr>
+        <w:t>Secondly, the description of the methodology should be improved. It would help if more details were given about the model training process, e.g., the structure of LSTM input data, normalization/scaling strategies, and how missing data were handled. The process for creating lagged features for each station and variable could be represented with a schematic or sample input table. For the bias correction step, other than a better detailed description of the formula used, an explicit justification and motivation for this choice would help.</w:t>
+      </w:r>
+    </w:p>
+    <w:p>
+      <w:pPr>
+        <w:pStyle w:val="Normal"/>
+        <w:rPr>
+          <w:color w:val="000000" w:themeColor="text1"/>
+        </w:rPr>
+      </w:pPr>
+      <w:r>
+        <w:rPr/>
+      </w:r>
+    </w:p>
+    <w:p>
+      <w:pPr>
+        <w:pStyle w:val="Normal"/>
+        <w:rPr>
+          <w:color w:val="000000" w:themeColor="text1"/>
+        </w:rPr>
+      </w:pPr>
+      <w:r>
+        <w:rPr>
+          <w:b/>
+          <w:bCs/>
+          <w:color w:val="000000" w:themeColor="text1"/>
+        </w:rPr>
+        <w:t>Answer</w:t>
+      </w:r>
+      <w:r>
+        <w:rPr>
+          <w:color w:val="000000" w:themeColor="text1"/>
+        </w:rPr>
+        <w:t>.</w:t>
+      </w:r>
+      <w:r>
+        <w:rPr>
+          <w:color w:val="FF0000"/>
+        </w:rPr>
+        <w:t xml:space="preserve"> We thank the reviewer for this constructive suggestion. The manuscript has been revised to provide a more detailed description of the modeling workflow. Specifically, we have clarified (i) the structure of the LSTM input data, (ii) the treatment of missing values, (iii) the generation of lagged features for each station and variable, and (iv) the application and motivation of the bias correction step. In addition, we include a representative example of the input feature structure to improve transparency and reproducibility. Please, refer to red-colored text in Sections 2.4, 2.8 and 3. </w:t>
+      </w:r>
+    </w:p>
+    <w:p>
+      <w:pPr>
+        <w:pStyle w:val="Normal"/>
+        <w:rPr>
+          <w:color w:val="FF0000"/>
+        </w:rPr>
+      </w:pPr>
+      <w:r>
+        <w:rPr>
+          <w:color w:val="FF0000"/>
+        </w:rPr>
+        <w:t xml:space="preserve">These additions indeed make the methodology clearer and easier to replicate. </w:t>
+      </w:r>
+    </w:p>
+    <w:p>
+      <w:pPr>
+        <w:pStyle w:val="Normal"/>
+        <w:rPr>
+          <w:color w:val="000000" w:themeColor="text1"/>
+        </w:rPr>
+      </w:pPr>
+      <w:r>
+        <w:rPr>
+          <w:color w:val="000000" w:themeColor="text1"/>
+        </w:rPr>
+      </w:r>
+    </w:p>
+    <w:p>
+      <w:pPr>
+        <w:pStyle w:val="Normal"/>
+        <w:rPr>
+          <w:color w:val="000000" w:themeColor="text1"/>
+        </w:rPr>
+      </w:pPr>
+      <w:r>
+        <w:rPr>
+          <w:color w:val="000000" w:themeColor="text1"/>
+        </w:rPr>
+        <w:t>Last but not least, this manuscript does not include a comparison of the proposed machine learning models against traditional process-based hydrological models. While the focus on ML is justified, benchmarking against a physical model—such as HBV, SWAT, or a simple rainfall-runoff conceptual model—would greatly strengthen the claims regarding ML performance and suitability for operational water management. At minimum, discussion and citation of relevant studies using such models for streamflow forecasting in comparable basins should be provided, so readers can assess the relative advantage and context of the ML results.</w:t>
+      </w:r>
+    </w:p>
+    <w:p>
+      <w:pPr>
+        <w:pStyle w:val="Normal"/>
+        <w:rPr>
+          <w:color w:val="000000" w:themeColor="text1"/>
+        </w:rPr>
+      </w:pPr>
+      <w:r>
+        <w:rPr/>
+      </w:r>
+    </w:p>
+    <w:p>
+      <w:pPr>
+        <w:pStyle w:val="Normal"/>
+        <w:rPr>
+          <w:color w:val="000000" w:themeColor="text1"/>
+        </w:rPr>
+      </w:pPr>
+      <w:r>
+        <w:rPr>
+          <w:b/>
+          <w:bCs/>
+          <w:color w:val="000000" w:themeColor="text1"/>
+        </w:rPr>
+        <w:t>Answer</w:t>
+      </w:r>
+      <w:r>
+        <w:rPr>
+          <w:color w:val="000000" w:themeColor="text1"/>
+        </w:rPr>
+        <w:t xml:space="preserve">.  </w:t>
+      </w:r>
+      <w:r>
+        <w:rPr>
+          <w:color w:val="FF0000"/>
+        </w:rPr>
+        <w:t xml:space="preserve"> We thank the reviewer for this important suggestion. We agree that benchmarking against process-based hydrological models (e.g., HBV, SWAT) would provide valuable additional context.  </w:t>
+      </w:r>
+    </w:p>
+    <w:p>
+      <w:pPr>
+        <w:pStyle w:val="Normal"/>
+        <w:rPr>
+          <w:color w:val="FF0000"/>
+        </w:rPr>
+      </w:pPr>
+      <w:r>
+        <w:rPr>
+          <w:color w:val="FF0000"/>
+        </w:rPr>
+        <w:t>The primary objective of this study, however, is to compare different machine learning approaches under a consistent data-driven framework using long-term hydro-meteorological observations. Implementing and calibrating a process-based hydrological model for the Bosna River basin would require additional data (e.g., soil properties, land use, basin characteristics) that are beyond the scope of the present study.</w:t>
+      </w:r>
+    </w:p>
+    <w:p>
+      <w:pPr>
+        <w:pStyle w:val="Normal"/>
+        <w:rPr>
+          <w:color w:val="FF0000"/>
+        </w:rPr>
+      </w:pPr>
+      <w:r>
+        <w:rPr>
+          <w:color w:val="FF0000"/>
+        </w:rPr>
+        <w:t>Nevertheless, we acknowledge the importance of such comparisons. In the revised manuscript, we have expanded the discussion to include references to studies employing conceptual and physically-based hydrological models in similar climatic and hydrological settings. This allows for a qualitative comparison of expected performance and provides context for interpreting the obtained machine learning result</w:t>
+      </w:r>
+      <w:r>
+        <w:rPr>
+          <w:color w:val="FF0000"/>
+        </w:rPr>
+        <w:t xml:space="preserve">s. </w:t>
+      </w:r>
+      <w:r>
+        <w:rPr>
+          <w:color w:val="FF0000"/>
+        </w:rPr>
+        <w:t xml:space="preserve">We also highlight the complementary nature of data-driven and process-based approaches, emphasizing that machine learning models can serve as efficient alternatives when detailed basin information is unavailable, while process-based models offer greater physical interpretability. </w:t>
+      </w:r>
+    </w:p>
+    <w:p>
+      <w:pPr>
+        <w:pStyle w:val="MDPI31text"/>
+        <w:ind w:hanging="0"/>
+        <w:rPr>
+          <w:color w:val="FF0000"/>
+        </w:rPr>
+      </w:pPr>
+      <w:r>
+        <w:rPr>
+          <w:color w:val="FF0000"/>
+        </w:rPr>
+        <w:t>T</w:t>
+      </w:r>
+      <w:r>
+        <w:rPr>
+          <w:color w:val="FF0000"/>
+        </w:rPr>
+        <w:t xml:space="preserve">he follwing sentence has been added in the Introduction: </w:t>
+      </w:r>
+    </w:p>
+    <w:p>
+      <w:pPr>
+        <w:pStyle w:val="MDPI31text"/>
+        <w:ind w:hanging="0"/>
+        <w:rPr>
+          <w:color w:val="FF0000"/>
+        </w:rPr>
+      </w:pPr>
+      <w:r>
+        <w:rPr>
+          <w:color w:val="FF0000"/>
+        </w:rPr>
+        <w:t>“</w:t>
+      </w:r>
+      <w:r>
+        <w:rPr>
+          <w:i/>
+          <w:iCs/>
+          <w:color w:val="FF0000"/>
+        </w:rPr>
+        <w:t>On the other hand, se</w:t>
+      </w:r>
+      <w:r>
+        <w:rPr>
+          <w:i/>
+          <w:iCs/>
+          <w:color w:val="FF0000"/>
+        </w:rPr>
+        <w:t xml:space="preserve">veral studies have successfully applied </w:t>
+      </w:r>
+      <w:r>
+        <w:rPr>
+          <w:i/>
+          <w:iCs/>
+          <w:color w:val="FF0000"/>
+        </w:rPr>
+        <w:t xml:space="preserve">alternative </w:t>
+      </w:r>
+      <w:r>
+        <w:rPr>
+          <w:i/>
+          <w:iCs/>
+          <w:color w:val="FF0000"/>
+        </w:rPr>
+        <w:t xml:space="preserve">HBV- and SWAT-type models </w:t>
+      </w:r>
+      <w:r>
+        <w:rPr>
+          <w:i/>
+          <w:iCs/>
+          <w:color w:val="FF0000"/>
+        </w:rPr>
+        <w:t>based on physical laws of hydrology simulating water movement step-by-step using explicit equations</w:t>
+      </w:r>
+      <w:r>
+        <w:rPr>
+          <w:i/>
+          <w:iCs/>
+          <w:color w:val="FF0000"/>
+        </w:rPr>
+        <w:t xml:space="preserve"> for monthly streamflow prediction. </w:t>
+      </w:r>
+      <w:r>
+        <w:rPr>
+          <w:i/>
+          <w:iCs/>
+          <w:color w:val="FF0000"/>
+        </w:rPr>
+        <w:t>It has been shown particularly useful for simulating stremflows in</w:t>
+      </w:r>
+      <w:r>
+        <w:rPr>
+          <w:i/>
+          <w:iCs/>
+          <w:color w:val="FF0000"/>
+        </w:rPr>
+        <w:t xml:space="preserve"> </w:t>
+      </w:r>
+      <w:r>
+        <w:rPr>
+          <w:i/>
+          <w:iCs/>
+          <w:color w:val="FF0000"/>
+        </w:rPr>
+        <w:t xml:space="preserve">various </w:t>
+      </w:r>
+      <w:r>
+        <w:rPr>
+          <w:i/>
+          <w:iCs/>
+          <w:color w:val="FF0000"/>
+        </w:rPr>
+        <w:t xml:space="preserve">basins </w:t>
+      </w:r>
+      <w:r>
+        <w:rPr>
+          <w:i/>
+          <w:iCs/>
+          <w:color w:val="FF0000"/>
+        </w:rPr>
+        <w:t>[57-59]</w:t>
+      </w:r>
+      <w:r>
+        <w:rPr>
+          <w:color w:val="FF0000"/>
+        </w:rPr>
+        <w:t>.”</w:t>
+      </w:r>
+    </w:p>
+    <w:p>
+      <w:pPr>
+        <w:pStyle w:val="Normal"/>
+        <w:rPr>
+          <w:color w:val="000000" w:themeColor="text1"/>
+        </w:rPr>
+      </w:pPr>
+      <w:r>
+        <w:rPr/>
+      </w:r>
+    </w:p>
+    <w:p>
+      <w:pPr>
+        <w:pStyle w:val="Normal"/>
+        <w:rPr>
+          <w:color w:val="000000" w:themeColor="text1"/>
+        </w:rPr>
+      </w:pPr>
+      <w:r>
+        <w:rPr/>
+      </w:r>
+    </w:p>
+    <w:p>
+      <w:pPr>
+        <w:pStyle w:val="Normal"/>
+        <w:rPr>
+          <w:color w:val="000000" w:themeColor="text1"/>
+        </w:rPr>
+      </w:pPr>
+      <w:r>
+        <w:rPr>
+          <w:color w:val="000000" w:themeColor="text1"/>
+        </w:rPr>
+        <w:t>The work will interest regional hydrologists, ML practitioners, and decision-makers in the Balkans. While for the broader hydrology audience, the use of monthly data and lack of physical model comparison may limit appeal. Including more discussion on generalization, limitations, and possible extensions would potentially increase reader interest.</w:t>
+      </w:r>
+    </w:p>
+    <w:p>
+      <w:pPr>
+        <w:pStyle w:val="Normal"/>
+        <w:rPr>
           <w:color w:val="EE0000"/>
         </w:rPr>
       </w:pPr>
       <w:r>
+        <w:rPr/>
+      </w:r>
+    </w:p>
+    <w:p>
+      <w:pPr>
+        <w:pStyle w:val="Normal"/>
+        <w:rPr>
+          <w:sz w:val="28"/>
+          <w:szCs w:val="28"/>
+          <w:u w:val="single"/>
+        </w:rPr>
+      </w:pPr>
+      <w:r>
         <w:rPr>
           <w:color w:val="EE0000"/>
-        </w:rPr>
-        <w:t>Reviewer 2</w:t>
+          <w:sz w:val="28"/>
+          <w:szCs w:val="28"/>
+          <w:u w:val="single"/>
+        </w:rPr>
+        <w:t>Reviewer 3</w:t>
       </w:r>
     </w:p>
     <w:p>
       <w:pPr>
         <w:pStyle w:val="Normal"/>
         <w:rPr>
-          <w:color w:val="000000" w:themeColor="text1"/>
-        </w:rPr>
-      </w:pPr>
-      <w:r>
-        <w:rPr>
-          <w:color w:val="000000" w:themeColor="text1"/>
-        </w:rPr>
-        <w:t>The manuscript presents an original application of machine learning (ML) techniques for streamflow forecasting in the Bosna River Basin, Bosnia and Herzegovina. The study compares Random Forest (RF), XGBoost, and Long Short-Term Memory (LSTM) models using a multi-decade dataset, highlighting the performance of tree-based ensemble methods over deep learning approaches. It further employs explainable AI (XAI) to interpret hydro-climatic predictors contributing to streamflow dynamics. The research is well-motivated and fills a gap in the regional literature.</w:t>
+          <w:color w:val="000000"/>
+        </w:rPr>
+      </w:pPr>
+      <w:r>
+        <w:rPr>
+          <w:color w:val="000000"/>
+        </w:rPr>
+        <w:t>T</w:t>
+      </w:r>
+      <w:r>
+        <w:rPr>
+          <w:color w:val="000000"/>
+        </w:rPr>
+        <w:t>he authors have utilzed machine learning (ML) methods to estimate streamflow values. However, the study appears largely similar to numerous existing works in the literature and does not provide a discernible contribution. In addition, the lack of clarity in the model construction and the insufficient predictive performance constitute notable shortcomings. My questions and comments regarding the manuscript are listed below:</w:t>
       </w:r>
     </w:p>
     <w:p>
       <w:pPr>
         <w:pStyle w:val="Normal"/>
         <w:rPr>
-          <w:color w:val="000000" w:themeColor="text1"/>
-        </w:rPr>
-      </w:pPr>
-      <w:r>
-        <w:rPr>
-          <w:color w:val="000000" w:themeColor="text1"/>
-        </w:rPr>
-      </w:r>
-    </w:p>
-    <w:p>
-      <w:pPr>
-        <w:pStyle w:val="Normal"/>
-        <w:rPr>
-          <w:color w:val="000000" w:themeColor="text1"/>
-        </w:rPr>
-      </w:pPr>
-      <w:r>
-        <w:rPr>
-          <w:color w:val="000000" w:themeColor="text1"/>
-        </w:rPr>
-        <w:t>However, there are several major concerns that prevent the acceptance of this paper at its status.</w:t>
-      </w:r>
-    </w:p>
-    <w:p>
-      <w:pPr>
-        <w:pStyle w:val="Normal"/>
-        <w:rPr>
-          <w:color w:val="000000" w:themeColor="text1"/>
-        </w:rPr>
-      </w:pPr>
-      <w:r>
-        <w:rPr>
-          <w:color w:val="000000" w:themeColor="text1"/>
-        </w:rPr>
-      </w:r>
-    </w:p>
-    <w:p>
-      <w:pPr>
-        <w:pStyle w:val="Normal"/>
-        <w:rPr>
-          <w:color w:val="000000" w:themeColor="text1"/>
-        </w:rPr>
-      </w:pPr>
-      <w:r>
-        <w:rPr>
-          <w:color w:val="000000" w:themeColor="text1"/>
-        </w:rPr>
-        <w:t>First and foremost, the use of monthly instead of daily streamflow data. While monthly streamflow forecasting is relevant for water resource planning and climate change studies, it is less relevant to short-term management such as operational flood forecasting, early warning systems etc. Monthly streamflow can not capture rapid hydrological events (e.g., flash floods, snowmelt pulses), peak flows, and more detailed hydrograph dynamics. More importantly, in terms of machine learning, choosing monthly streamflow significantly reduces the size of the training sample, which has important implications for model performance. Machine learning models, and especially deep learning models like LSTM, generally require large sample sizes to perform robustly and avoid overfitting or underfitting, which is reflected in the results: the manuscript shows that LSTM performed significantly worse than Random Forest and XGBoost. The performance gap between training and testing highlights non-stationarity and the challenge of extracting predictive skill from limited monthly samples.</w:t>
-      </w:r>
-    </w:p>
-    <w:p>
-      <w:pPr>
-        <w:pStyle w:val="Normal"/>
-        <w:rPr>
-          <w:color w:val="000000" w:themeColor="text1"/>
-        </w:rPr>
-      </w:pPr>
-      <w:r>
-        <w:rPr>
-          <w:color w:val="000000" w:themeColor="text1"/>
-        </w:rPr>
-        <w:t>Secondly, the description of the methodology should be improved. It would help if more details were given about the model training process, e.g., the structure of LSTM input data, normalization/scaling strategies, and how missing data were handled. The process for creating lagged features for each station and variable could be represented with a schematic or sample input table. For the bias correction step, other than a better detailed description of the formula used, an explicit justification and motivation for this choice would help.</w:t>
-      </w:r>
-    </w:p>
-    <w:p>
-      <w:pPr>
-        <w:pStyle w:val="Normal"/>
-        <w:rPr>
-          <w:color w:val="000000" w:themeColor="text1"/>
-        </w:rPr>
-      </w:pPr>
-      <w:r>
-        <w:rPr>
-          <w:color w:val="000000" w:themeColor="text1"/>
-        </w:rPr>
-      </w:r>
-    </w:p>
-    <w:p>
-      <w:pPr>
-        <w:pStyle w:val="Normal"/>
-        <w:rPr>
-          <w:color w:val="000000" w:themeColor="text1"/>
-        </w:rPr>
-      </w:pPr>
-      <w:r>
-        <w:rPr>
-          <w:color w:val="000000" w:themeColor="text1"/>
-        </w:rPr>
-        <w:t>Last but not least, this manuscript does not include a comparison of the proposed machine learning models against traditional process-based hydrological models. While the focus on ML is justified, benchmarking against a physical model—such as HBV, SWAT, or a simple rainfall-runoff conceptual model—would greatly strengthen the claims regarding ML performance and suitability for operational water management. At minimum, discussion and citation of relevant studies using such models for streamflow forecasting in comparable basins should be provided, so readers can assess the relative advantage and context of the ML results.</w:t>
-      </w:r>
-    </w:p>
-    <w:p>
-      <w:pPr>
-        <w:pStyle w:val="Normal"/>
-        <w:rPr>
-          <w:color w:val="000000" w:themeColor="text1"/>
-        </w:rPr>
-      </w:pPr>
-      <w:r>
-        <w:rPr>
-          <w:color w:val="000000" w:themeColor="text1"/>
-        </w:rPr>
-      </w:r>
-    </w:p>
-    <w:p>
-      <w:pPr>
-        <w:pStyle w:val="Normal"/>
-        <w:rPr>
-          <w:color w:val="000000" w:themeColor="text1"/>
-        </w:rPr>
-      </w:pPr>
-      <w:r>
-        <w:rPr>
-          <w:color w:val="000000" w:themeColor="text1"/>
-        </w:rPr>
-        <w:t>The work will interest regional hydrologists, ML practitioners, and decision-makers in the Balkans. While for the broader hydrology audience, the use of monthly data and lack of physical model comparison may limit appeal. Including more discussion on generalization, limitations, and possible extensions would potentially increase reader interest.</w:t>
-      </w:r>
-    </w:p>
-    <w:p>
-      <w:pPr>
-        <w:pStyle w:val="Normal"/>
-        <w:rPr>
-          <w:color w:val="EE0000"/>
-        </w:rPr>
-      </w:pPr>
-      <w:r>
-        <w:rPr>
-          <w:color w:val="EE0000"/>
-        </w:rPr>
-      </w:r>
-    </w:p>
-    <w:p>
-      <w:pPr>
-        <w:pStyle w:val="Normal"/>
-        <w:rPr>
-          <w:color w:val="EE0000"/>
-        </w:rPr>
-      </w:pPr>
-      <w:r>
-        <w:rPr/>
-      </w:r>
-    </w:p>
-    <w:p>
-      <w:pPr>
-        <w:pStyle w:val="Normal"/>
-        <w:rPr>
-          <w:color w:val="EE0000"/>
-        </w:rPr>
-      </w:pPr>
-      <w:r>
-        <w:rPr/>
-      </w:r>
-    </w:p>
-    <w:p>
-      <w:pPr>
-        <w:pStyle w:val="Normal"/>
-        <w:rPr>
-          <w:color w:val="EE0000"/>
-        </w:rPr>
-      </w:pPr>
-      <w:r>
-        <w:rPr/>
-      </w:r>
-    </w:p>
-    <w:p>
-      <w:pPr>
-        <w:pStyle w:val="Normal"/>
-        <w:rPr>
-          <w:color w:val="EE0000"/>
-        </w:rPr>
-      </w:pPr>
-      <w:r>
-        <w:rPr/>
-      </w:r>
-    </w:p>
-    <w:p>
-      <w:pPr>
-        <w:pStyle w:val="Normal"/>
-        <w:rPr>
-          <w:color w:val="EE0000"/>
-        </w:rPr>
-      </w:pPr>
-      <w:r>
-        <w:rPr/>
-      </w:r>
-    </w:p>
-    <w:p>
-      <w:pPr>
-        <w:pStyle w:val="Normal"/>
-        <w:rPr>
-          <w:color w:val="EE0000"/>
-        </w:rPr>
-      </w:pPr>
-      <w:r>
-        <w:rPr/>
-      </w:r>
-    </w:p>
-    <w:p>
-      <w:pPr>
-        <w:pStyle w:val="Normal"/>
-        <w:rPr>
-          <w:color w:val="EE0000"/>
-        </w:rPr>
-      </w:pPr>
-      <w:r>
-        <w:rPr/>
-      </w:r>
-    </w:p>
-    <w:p>
-      <w:pPr>
-        <w:pStyle w:val="Normal"/>
-        <w:rPr>
-          <w:color w:val="EE0000"/>
-        </w:rPr>
-      </w:pPr>
-      <w:r>
-        <w:rPr/>
-      </w:r>
-    </w:p>
-    <w:p>
-      <w:pPr>
-        <w:pStyle w:val="Normal"/>
-        <w:rPr>
-          <w:color w:val="EE0000"/>
-        </w:rPr>
-      </w:pPr>
-      <w:r>
-        <w:rPr/>
-      </w:r>
-    </w:p>
-    <w:p>
-      <w:pPr>
-        <w:pStyle w:val="Normal"/>
-        <w:rPr>
-          <w:color w:val="EE0000"/>
-        </w:rPr>
-      </w:pPr>
-      <w:r>
-        <w:rPr/>
-      </w:r>
-    </w:p>
-    <w:p>
-      <w:pPr>
-        <w:pStyle w:val="Normal"/>
-        <w:rPr>
-          <w:color w:val="EE0000"/>
-        </w:rPr>
-      </w:pPr>
-      <w:r>
-        <w:rPr>
-          <w:color w:val="EE0000"/>
-        </w:rPr>
-        <w:t>Reviewer 3</w:t>
-      </w:r>
-    </w:p>
-    <w:p>
-      <w:pPr>
-        <w:pStyle w:val="Normal"/>
-        <w:rPr>
-          <w:color w:val="EE0000"/>
-        </w:rPr>
-      </w:pPr>
-      <w:r>
-        <w:rPr>
-          <w:color w:val="EE0000"/>
-        </w:rPr>
-        <w:t>T</w:t>
-      </w:r>
-      <w:r>
-        <w:rPr>
-          <w:color w:val="EE0000"/>
-        </w:rPr>
-        <w:t>he authors have utilzed machine learning (ML) methods to estimate streamflow values. However, the study appears largely similar to numerous existing works in the literature and does not provide a discernible contribution. In addition, the lack of clarity in the model construction and the insufficient predictive performance constitute notable shortcomings. My questions and comments regarding the manuscript are listed below:</w:t>
-      </w:r>
-    </w:p>
-    <w:p>
-      <w:pPr>
-        <w:pStyle w:val="Normal"/>
-        <w:rPr>
-          <w:color w:val="EE0000"/>
-        </w:rPr>
-      </w:pPr>
-      <w:r>
-        <w:rPr>
-          <w:color w:val="EE0000"/>
+          <w:color w:val="000000"/>
+        </w:rPr>
+      </w:pPr>
+      <w:r>
+        <w:rPr>
+          <w:color w:val="000000"/>
         </w:rPr>
       </w:r>
     </w:p>
@@ -1221,6 +1544,55 @@
         <w:pStyle w:val="ListParagraph"/>
         <w:numPr>
           <w:ilvl w:val="0"/>
+          <w:numId w:val="0"/>
+        </w:numPr>
+        <w:ind w:left="720" w:hanging="0"/>
+        <w:rPr>
+          <w:color w:val="000000" w:themeColor="text1"/>
+        </w:rPr>
+      </w:pPr>
+      <w:r>
+        <w:rPr>
+          <w:b/>
+          <w:bCs/>
+          <w:color w:val="000000" w:themeColor="text1"/>
+        </w:rPr>
+        <w:t>Answer</w:t>
+      </w:r>
+      <w:r>
+        <w:rPr>
+          <w:color w:val="000000" w:themeColor="text1"/>
+        </w:rPr>
+        <w:t xml:space="preserve">. </w:t>
+      </w:r>
+      <w:r>
+        <w:rPr>
+          <w:color w:val="BF0041"/>
+        </w:rPr>
+        <w:t>TODO</w:t>
+      </w:r>
+    </w:p>
+    <w:p>
+      <w:pPr>
+        <w:pStyle w:val="ListParagraph"/>
+        <w:numPr>
+          <w:ilvl w:val="0"/>
+          <w:numId w:val="0"/>
+        </w:numPr>
+        <w:ind w:left="720" w:hanging="0"/>
+        <w:rPr>
+          <w:color w:val="000000" w:themeColor="text1"/>
+        </w:rPr>
+      </w:pPr>
+      <w:r>
+        <w:rPr/>
+      </w:r>
+    </w:p>
+    <w:p>
+      <w:pPr>
+        <w:pStyle w:val="ListParagraph"/>
+        <w:numPr>
+          <w:ilvl w:val="0"/>
           <w:numId w:val="2"/>
         </w:numPr>
         <w:rPr>
@@ -1239,6 +1611,60 @@
         <w:pStyle w:val="ListParagraph"/>
         <w:numPr>
           <w:ilvl w:val="0"/>
+          <w:numId w:val="0"/>
+        </w:numPr>
+        <w:ind w:left="720" w:hanging="0"/>
+        <w:rPr>
+          <w:color w:val="000000" w:themeColor="text1"/>
+        </w:rPr>
+      </w:pPr>
+      <w:r>
+        <w:rPr/>
+      </w:r>
+    </w:p>
+    <w:p>
+      <w:pPr>
+        <w:pStyle w:val="ListParagraph"/>
+        <w:numPr>
+          <w:ilvl w:val="0"/>
+          <w:numId w:val="0"/>
+        </w:numPr>
+        <w:ind w:left="720" w:hanging="0"/>
+        <w:rPr>
+          <w:color w:val="000000" w:themeColor="text1"/>
+        </w:rPr>
+      </w:pPr>
+      <w:r>
+        <w:rPr>
+          <w:b/>
+          <w:bCs/>
+          <w:color w:val="000000" w:themeColor="text1"/>
+        </w:rPr>
+        <w:t>Answer</w:t>
+      </w:r>
+      <w:r>
+        <w:rPr>
+          <w:color w:val="000000" w:themeColor="text1"/>
+        </w:rPr>
+        <w:t>. Marko: My suggestion is to revise the abstract: emphasize the use of xAI as a novel strategy in understanding  predicted stremflow more trustworthy.</w:t>
+      </w:r>
+    </w:p>
+    <w:p>
+      <w:pPr>
+        <w:pStyle w:val="ListParagraph"/>
+        <w:rPr>
+          <w:color w:val="000000" w:themeColor="text1"/>
+        </w:rPr>
+      </w:pPr>
+      <w:r>
+        <w:rPr/>
+      </w:r>
+    </w:p>
+    <w:p>
+      <w:pPr>
+        <w:pStyle w:val="ListParagraph"/>
+        <w:numPr>
+          <w:ilvl w:val="0"/>
           <w:numId w:val="2"/>
         </w:numPr>
         <w:rPr>
@@ -1257,6 +1683,49 @@
         <w:pStyle w:val="ListParagraph"/>
         <w:numPr>
           <w:ilvl w:val="0"/>
+          <w:numId w:val="0"/>
+        </w:numPr>
+        <w:ind w:left="720" w:hanging="0"/>
+        <w:rPr>
+          <w:color w:val="000000" w:themeColor="text1"/>
+        </w:rPr>
+      </w:pPr>
+      <w:r>
+        <w:rPr>
+          <w:b/>
+          <w:bCs/>
+          <w:color w:val="000000" w:themeColor="text1"/>
+        </w:rPr>
+        <w:t>Answer</w:t>
+      </w:r>
+      <w:r>
+        <w:rPr>
+          <w:color w:val="000000" w:themeColor="text1"/>
+        </w:rPr>
+        <w:t xml:space="preserve">. Similar, referring to the later question. </w:t>
+      </w:r>
+    </w:p>
+    <w:p>
+      <w:pPr>
+        <w:pStyle w:val="ListParagraph"/>
+        <w:numPr>
+          <w:ilvl w:val="0"/>
+          <w:numId w:val="0"/>
+        </w:numPr>
+        <w:ind w:left="720" w:hanging="0"/>
+        <w:rPr>
+          <w:color w:val="000000" w:themeColor="text1"/>
+        </w:rPr>
+      </w:pPr>
+      <w:r>
+        <w:rPr/>
+      </w:r>
+    </w:p>
+    <w:p>
+      <w:pPr>
+        <w:pStyle w:val="ListParagraph"/>
+        <w:numPr>
+          <w:ilvl w:val="0"/>
           <w:numId w:val="2"/>
         </w:numPr>
         <w:rPr>
@@ -1275,6 +1744,33 @@
         <w:pStyle w:val="ListParagraph"/>
         <w:numPr>
           <w:ilvl w:val="0"/>
+          <w:numId w:val="0"/>
+        </w:numPr>
+        <w:ind w:left="720" w:hanging="0"/>
+        <w:rPr>
+          <w:color w:val="000000" w:themeColor="text1"/>
+        </w:rPr>
+      </w:pPr>
+      <w:r>
+        <w:rPr>
+          <w:b/>
+          <w:bCs/>
+          <w:color w:val="000000" w:themeColor="text1"/>
+        </w:rPr>
+        <w:t>Answer</w:t>
+      </w:r>
+      <w:r>
+        <w:rPr>
+          <w:color w:val="000000" w:themeColor="text1"/>
+        </w:rPr>
+        <w:t>. TODO</w:t>
+      </w:r>
+    </w:p>
+    <w:p>
+      <w:pPr>
+        <w:pStyle w:val="ListParagraph"/>
+        <w:numPr>
+          <w:ilvl w:val="0"/>
           <w:numId w:val="2"/>
         </w:numPr>
         <w:rPr>
@@ -1293,6 +1789,33 @@
         <w:pStyle w:val="ListParagraph"/>
         <w:numPr>
           <w:ilvl w:val="0"/>
+          <w:numId w:val="0"/>
+        </w:numPr>
+        <w:ind w:left="720" w:hanging="0"/>
+        <w:rPr>
+          <w:color w:val="000000" w:themeColor="text1"/>
+        </w:rPr>
+      </w:pPr>
+      <w:r>
+        <w:rPr>
+          <w:b/>
+          <w:bCs/>
+          <w:color w:val="000000" w:themeColor="text1"/>
+        </w:rPr>
+        <w:t>Answer</w:t>
+      </w:r>
+      <w:r>
+        <w:rPr>
+          <w:color w:val="000000" w:themeColor="text1"/>
+        </w:rPr>
+        <w:t>. TODO</w:t>
+      </w:r>
+    </w:p>
+    <w:p>
+      <w:pPr>
+        <w:pStyle w:val="ListParagraph"/>
+        <w:numPr>
+          <w:ilvl w:val="0"/>
           <w:numId w:val="2"/>
         </w:numPr>
         <w:rPr>
@@ -1311,6 +1834,33 @@
         <w:pStyle w:val="ListParagraph"/>
         <w:numPr>
           <w:ilvl w:val="0"/>
+          <w:numId w:val="0"/>
+        </w:numPr>
+        <w:ind w:left="720" w:hanging="0"/>
+        <w:rPr>
+          <w:color w:val="000000" w:themeColor="text1"/>
+        </w:rPr>
+      </w:pPr>
+      <w:r>
+        <w:rPr>
+          <w:b/>
+          <w:bCs/>
+          <w:color w:val="000000" w:themeColor="text1"/>
+        </w:rPr>
+        <w:t>Answer</w:t>
+      </w:r>
+      <w:r>
+        <w:rPr>
+          <w:color w:val="000000" w:themeColor="text1"/>
+        </w:rPr>
+        <w:t>. TODO</w:t>
+      </w:r>
+    </w:p>
+    <w:p>
+      <w:pPr>
+        <w:pStyle w:val="ListParagraph"/>
+        <w:numPr>
+          <w:ilvl w:val="0"/>
           <w:numId w:val="2"/>
         </w:numPr>
         <w:rPr>
@@ -1329,6 +1879,33 @@
         <w:pStyle w:val="ListParagraph"/>
         <w:numPr>
           <w:ilvl w:val="0"/>
+          <w:numId w:val="0"/>
+        </w:numPr>
+        <w:ind w:left="720" w:hanging="0"/>
+        <w:rPr>
+          <w:color w:val="000000" w:themeColor="text1"/>
+        </w:rPr>
+      </w:pPr>
+      <w:r>
+        <w:rPr>
+          <w:b/>
+          <w:bCs/>
+          <w:color w:val="000000" w:themeColor="text1"/>
+        </w:rPr>
+        <w:t>Answer</w:t>
+      </w:r>
+      <w:r>
+        <w:rPr>
+          <w:color w:val="000000" w:themeColor="text1"/>
+        </w:rPr>
+        <w:t>. TODO</w:t>
+      </w:r>
+    </w:p>
+    <w:p>
+      <w:pPr>
+        <w:pStyle w:val="ListParagraph"/>
+        <w:numPr>
+          <w:ilvl w:val="0"/>
           <w:numId w:val="2"/>
         </w:numPr>
         <w:rPr>
@@ -1347,6 +1924,49 @@
         <w:pStyle w:val="ListParagraph"/>
         <w:numPr>
           <w:ilvl w:val="0"/>
+          <w:numId w:val="0"/>
+        </w:numPr>
+        <w:ind w:left="720" w:hanging="0"/>
+        <w:rPr>
+          <w:color w:val="000000" w:themeColor="text1"/>
+        </w:rPr>
+      </w:pPr>
+      <w:r>
+        <w:rPr>
+          <w:b/>
+          <w:bCs/>
+          <w:color w:val="000000" w:themeColor="text1"/>
+        </w:rPr>
+        <w:t>Answer</w:t>
+      </w:r>
+      <w:r>
+        <w:rPr>
+          <w:color w:val="000000" w:themeColor="text1"/>
+        </w:rPr>
+        <w:t>. TODO</w:t>
+      </w:r>
+    </w:p>
+    <w:p>
+      <w:pPr>
+        <w:pStyle w:val="ListParagraph"/>
+        <w:numPr>
+          <w:ilvl w:val="0"/>
+          <w:numId w:val="0"/>
+        </w:numPr>
+        <w:ind w:left="720" w:hanging="0"/>
+        <w:rPr>
+          <w:color w:val="000000" w:themeColor="text1"/>
+        </w:rPr>
+      </w:pPr>
+      <w:r>
+        <w:rPr/>
+      </w:r>
+    </w:p>
+    <w:p>
+      <w:pPr>
+        <w:pStyle w:val="ListParagraph"/>
+        <w:numPr>
+          <w:ilvl w:val="0"/>
           <w:numId w:val="2"/>
         </w:numPr>
         <w:rPr>
@@ -1365,6 +1985,33 @@
         <w:pStyle w:val="ListParagraph"/>
         <w:numPr>
           <w:ilvl w:val="0"/>
+          <w:numId w:val="0"/>
+        </w:numPr>
+        <w:ind w:left="720" w:hanging="0"/>
+        <w:rPr>
+          <w:color w:val="000000" w:themeColor="text1"/>
+        </w:rPr>
+      </w:pPr>
+      <w:r>
+        <w:rPr>
+          <w:b/>
+          <w:bCs/>
+          <w:color w:val="000000" w:themeColor="text1"/>
+        </w:rPr>
+        <w:t>Answer</w:t>
+      </w:r>
+      <w:r>
+        <w:rPr>
+          <w:color w:val="000000" w:themeColor="text1"/>
+        </w:rPr>
+        <w:t>. TODO</w:t>
+      </w:r>
+    </w:p>
+    <w:p>
+      <w:pPr>
+        <w:pStyle w:val="ListParagraph"/>
+        <w:numPr>
+          <w:ilvl w:val="0"/>
           <w:numId w:val="2"/>
         </w:numPr>
         <w:rPr>
@@ -1383,6 +2030,49 @@
         <w:pStyle w:val="ListParagraph"/>
         <w:numPr>
           <w:ilvl w:val="0"/>
+          <w:numId w:val="0"/>
+        </w:numPr>
+        <w:ind w:left="720" w:hanging="0"/>
+        <w:rPr>
+          <w:color w:val="000000" w:themeColor="text1"/>
+        </w:rPr>
+      </w:pPr>
+      <w:r>
+        <w:rPr>
+          <w:b/>
+          <w:bCs/>
+          <w:color w:val="000000" w:themeColor="text1"/>
+        </w:rPr>
+        <w:t>Answer</w:t>
+      </w:r>
+      <w:r>
+        <w:rPr>
+          <w:color w:val="000000" w:themeColor="text1"/>
+        </w:rPr>
+        <w:t>. I need to think about how to convince the reviewer not to delete this part. I believe it has its value in the end.</w:t>
+      </w:r>
+    </w:p>
+    <w:p>
+      <w:pPr>
+        <w:pStyle w:val="ListParagraph"/>
+        <w:numPr>
+          <w:ilvl w:val="0"/>
+          <w:numId w:val="0"/>
+        </w:numPr>
+        <w:ind w:left="720" w:hanging="0"/>
+        <w:rPr>
+          <w:color w:val="000000" w:themeColor="text1"/>
+        </w:rPr>
+      </w:pPr>
+      <w:r>
+        <w:rPr/>
+      </w:r>
+    </w:p>
+    <w:p>
+      <w:pPr>
+        <w:pStyle w:val="ListParagraph"/>
+        <w:numPr>
+          <w:ilvl w:val="0"/>
           <w:numId w:val="2"/>
         </w:numPr>
         <w:rPr>
@@ -1401,6 +2091,49 @@
         <w:pStyle w:val="ListParagraph"/>
         <w:numPr>
           <w:ilvl w:val="0"/>
+          <w:numId w:val="0"/>
+        </w:numPr>
+        <w:ind w:left="720" w:hanging="0"/>
+        <w:rPr>
+          <w:color w:val="000000" w:themeColor="text1"/>
+        </w:rPr>
+      </w:pPr>
+      <w:r>
+        <w:rPr>
+          <w:b/>
+          <w:bCs/>
+          <w:color w:val="000000" w:themeColor="text1"/>
+        </w:rPr>
+        <w:t>Answer</w:t>
+      </w:r>
+      <w:r>
+        <w:rPr>
+          <w:color w:val="000000" w:themeColor="text1"/>
+        </w:rPr>
+        <w:t>. TODO</w:t>
+      </w:r>
+    </w:p>
+    <w:p>
+      <w:pPr>
+        <w:pStyle w:val="ListParagraph"/>
+        <w:numPr>
+          <w:ilvl w:val="0"/>
+          <w:numId w:val="0"/>
+        </w:numPr>
+        <w:ind w:left="720" w:hanging="0"/>
+        <w:rPr>
+          <w:color w:val="000000" w:themeColor="text1"/>
+        </w:rPr>
+      </w:pPr>
+      <w:r>
+        <w:rPr/>
+      </w:r>
+    </w:p>
+    <w:p>
+      <w:pPr>
+        <w:pStyle w:val="ListParagraph"/>
+        <w:numPr>
+          <w:ilvl w:val="0"/>
           <w:numId w:val="2"/>
         </w:numPr>
         <w:rPr>
@@ -1419,6 +2152,33 @@
         <w:pStyle w:val="ListParagraph"/>
         <w:numPr>
           <w:ilvl w:val="0"/>
+          <w:numId w:val="0"/>
+        </w:numPr>
+        <w:ind w:left="720" w:hanging="0"/>
+        <w:rPr>
+          <w:color w:val="000000" w:themeColor="text1"/>
+        </w:rPr>
+      </w:pPr>
+      <w:r>
+        <w:rPr>
+          <w:b/>
+          <w:bCs/>
+          <w:color w:val="000000" w:themeColor="text1"/>
+        </w:rPr>
+        <w:t>Answer</w:t>
+      </w:r>
+      <w:r>
+        <w:rPr>
+          <w:color w:val="000000" w:themeColor="text1"/>
+        </w:rPr>
+        <w:t>. TODO</w:t>
+      </w:r>
+    </w:p>
+    <w:p>
+      <w:pPr>
+        <w:pStyle w:val="ListParagraph"/>
+        <w:numPr>
+          <w:ilvl w:val="0"/>
           <w:numId w:val="2"/>
         </w:numPr>
         <w:rPr>
@@ -1437,6 +2197,33 @@
         <w:pStyle w:val="ListParagraph"/>
         <w:numPr>
           <w:ilvl w:val="0"/>
+          <w:numId w:val="0"/>
+        </w:numPr>
+        <w:ind w:left="720" w:hanging="0"/>
+        <w:rPr>
+          <w:color w:val="000000" w:themeColor="text1"/>
+        </w:rPr>
+      </w:pPr>
+      <w:r>
+        <w:rPr>
+          <w:b/>
+          <w:bCs/>
+          <w:color w:val="000000" w:themeColor="text1"/>
+        </w:rPr>
+        <w:t>Answer</w:t>
+      </w:r>
+      <w:r>
+        <w:rPr>
+          <w:color w:val="000000" w:themeColor="text1"/>
+        </w:rPr>
+        <w:t>. TODO</w:t>
+      </w:r>
+    </w:p>
+    <w:p>
+      <w:pPr>
+        <w:pStyle w:val="ListParagraph"/>
+        <w:numPr>
+          <w:ilvl w:val="0"/>
           <w:numId w:val="2"/>
         </w:numPr>
         <w:rPr>
@@ -1455,6 +2242,33 @@
         <w:pStyle w:val="ListParagraph"/>
         <w:numPr>
           <w:ilvl w:val="0"/>
+          <w:numId w:val="0"/>
+        </w:numPr>
+        <w:ind w:left="720" w:hanging="0"/>
+        <w:rPr>
+          <w:color w:val="000000" w:themeColor="text1"/>
+        </w:rPr>
+      </w:pPr>
+      <w:r>
+        <w:rPr>
+          <w:b/>
+          <w:bCs/>
+          <w:color w:val="000000" w:themeColor="text1"/>
+        </w:rPr>
+        <w:t>Answer</w:t>
+      </w:r>
+      <w:r>
+        <w:rPr>
+          <w:color w:val="000000" w:themeColor="text1"/>
+        </w:rPr>
+        <w:t>. TODO</w:t>
+      </w:r>
+    </w:p>
+    <w:p>
+      <w:pPr>
+        <w:pStyle w:val="ListParagraph"/>
+        <w:numPr>
+          <w:ilvl w:val="0"/>
           <w:numId w:val="2"/>
         </w:numPr>
         <w:rPr>
@@ -1473,6 +2287,33 @@
         <w:pStyle w:val="ListParagraph"/>
         <w:numPr>
           <w:ilvl w:val="0"/>
+          <w:numId w:val="0"/>
+        </w:numPr>
+        <w:ind w:left="720" w:hanging="0"/>
+        <w:rPr>
+          <w:color w:val="000000" w:themeColor="text1"/>
+        </w:rPr>
+      </w:pPr>
+      <w:r>
+        <w:rPr>
+          <w:b/>
+          <w:bCs/>
+          <w:color w:val="000000" w:themeColor="text1"/>
+        </w:rPr>
+        <w:t>Answer</w:t>
+      </w:r>
+      <w:r>
+        <w:rPr>
+          <w:color w:val="000000" w:themeColor="text1"/>
+        </w:rPr>
+        <w:t>. TODO</w:t>
+      </w:r>
+    </w:p>
+    <w:p>
+      <w:pPr>
+        <w:pStyle w:val="ListParagraph"/>
+        <w:numPr>
+          <w:ilvl w:val="0"/>
           <w:numId w:val="2"/>
         </w:numPr>
         <w:rPr>
@@ -1491,6 +2332,33 @@
         <w:pStyle w:val="ListParagraph"/>
         <w:numPr>
           <w:ilvl w:val="0"/>
+          <w:numId w:val="0"/>
+        </w:numPr>
+        <w:ind w:left="720" w:hanging="0"/>
+        <w:rPr>
+          <w:color w:val="000000" w:themeColor="text1"/>
+        </w:rPr>
+      </w:pPr>
+      <w:r>
+        <w:rPr>
+          <w:b/>
+          <w:bCs/>
+          <w:color w:val="000000" w:themeColor="text1"/>
+        </w:rPr>
+        <w:t>Answer</w:t>
+      </w:r>
+      <w:r>
+        <w:rPr>
+          <w:color w:val="000000" w:themeColor="text1"/>
+        </w:rPr>
+        <w:t>. TODO</w:t>
+      </w:r>
+    </w:p>
+    <w:p>
+      <w:pPr>
+        <w:pStyle w:val="ListParagraph"/>
+        <w:numPr>
+          <w:ilvl w:val="0"/>
           <w:numId w:val="2"/>
         </w:numPr>
         <w:rPr>
@@ -1509,6 +2377,33 @@
         <w:pStyle w:val="ListParagraph"/>
         <w:numPr>
           <w:ilvl w:val="0"/>
+          <w:numId w:val="0"/>
+        </w:numPr>
+        <w:ind w:left="720" w:hanging="0"/>
+        <w:rPr>
+          <w:color w:val="000000" w:themeColor="text1"/>
+        </w:rPr>
+      </w:pPr>
+      <w:r>
+        <w:rPr>
+          <w:b/>
+          <w:bCs/>
+          <w:color w:val="000000" w:themeColor="text1"/>
+        </w:rPr>
+        <w:t>Answer</w:t>
+      </w:r>
+      <w:r>
+        <w:rPr>
+          <w:color w:val="000000" w:themeColor="text1"/>
+        </w:rPr>
+        <w:t>. TODO</w:t>
+      </w:r>
+    </w:p>
+    <w:p>
+      <w:pPr>
+        <w:pStyle w:val="ListParagraph"/>
+        <w:numPr>
+          <w:ilvl w:val="0"/>
           <w:numId w:val="2"/>
         </w:numPr>
         <w:rPr>
@@ -1527,6 +2422,33 @@
         <w:pStyle w:val="ListParagraph"/>
         <w:numPr>
           <w:ilvl w:val="0"/>
+          <w:numId w:val="0"/>
+        </w:numPr>
+        <w:ind w:left="720" w:hanging="0"/>
+        <w:rPr>
+          <w:color w:val="000000" w:themeColor="text1"/>
+        </w:rPr>
+      </w:pPr>
+      <w:r>
+        <w:rPr>
+          <w:b/>
+          <w:bCs/>
+          <w:color w:val="000000" w:themeColor="text1"/>
+        </w:rPr>
+        <w:t>Answer</w:t>
+      </w:r>
+      <w:r>
+        <w:rPr>
+          <w:color w:val="000000" w:themeColor="text1"/>
+        </w:rPr>
+        <w:t>. TODO</w:t>
+      </w:r>
+    </w:p>
+    <w:p>
+      <w:pPr>
+        <w:pStyle w:val="ListParagraph"/>
+        <w:numPr>
+          <w:ilvl w:val="0"/>
           <w:numId w:val="2"/>
         </w:numPr>
         <w:rPr>
@@ -1545,6 +2467,33 @@
         <w:pStyle w:val="ListParagraph"/>
         <w:numPr>
           <w:ilvl w:val="0"/>
+          <w:numId w:val="0"/>
+        </w:numPr>
+        <w:ind w:left="720" w:hanging="0"/>
+        <w:rPr>
+          <w:color w:val="000000" w:themeColor="text1"/>
+        </w:rPr>
+      </w:pPr>
+      <w:r>
+        <w:rPr>
+          <w:b/>
+          <w:bCs/>
+          <w:color w:val="000000" w:themeColor="text1"/>
+        </w:rPr>
+        <w:t>Answer</w:t>
+      </w:r>
+      <w:r>
+        <w:rPr>
+          <w:color w:val="000000" w:themeColor="text1"/>
+        </w:rPr>
+        <w:t>. TODO</w:t>
+      </w:r>
+    </w:p>
+    <w:p>
+      <w:pPr>
+        <w:pStyle w:val="ListParagraph"/>
+        <w:numPr>
+          <w:ilvl w:val="0"/>
           <w:numId w:val="2"/>
         </w:numPr>
         <w:rPr>
@@ -1563,6 +2512,33 @@
         <w:pStyle w:val="ListParagraph"/>
         <w:numPr>
           <w:ilvl w:val="0"/>
+          <w:numId w:val="0"/>
+        </w:numPr>
+        <w:ind w:left="720" w:hanging="0"/>
+        <w:rPr>
+          <w:color w:val="000000" w:themeColor="text1"/>
+        </w:rPr>
+      </w:pPr>
+      <w:r>
+        <w:rPr>
+          <w:b/>
+          <w:bCs/>
+          <w:color w:val="000000" w:themeColor="text1"/>
+        </w:rPr>
+        <w:t>Answer</w:t>
+      </w:r>
+      <w:r>
+        <w:rPr>
+          <w:color w:val="000000" w:themeColor="text1"/>
+        </w:rPr>
+        <w:t>. TODO</w:t>
+      </w:r>
+    </w:p>
+    <w:p>
+      <w:pPr>
+        <w:pStyle w:val="ListParagraph"/>
+        <w:numPr>
+          <w:ilvl w:val="0"/>
           <w:numId w:val="2"/>
         </w:numPr>
         <w:rPr>
@@ -1574,6 +2550,33 @@
           <w:color w:val="000000" w:themeColor="text1"/>
         </w:rPr>
         <w:t>The references cited in line 435-particularly reference 56-do not appear to support the stated claim.</w:t>
+      </w:r>
+    </w:p>
+    <w:p>
+      <w:pPr>
+        <w:pStyle w:val="ListParagraph"/>
+        <w:numPr>
+          <w:ilvl w:val="0"/>
+          <w:numId w:val="0"/>
+        </w:numPr>
+        <w:ind w:left="720" w:hanging="0"/>
+        <w:rPr>
+          <w:color w:val="000000" w:themeColor="text1"/>
+        </w:rPr>
+      </w:pPr>
+      <w:r>
+        <w:rPr>
+          <w:b/>
+          <w:bCs/>
+          <w:color w:val="000000" w:themeColor="text1"/>
+        </w:rPr>
+        <w:t>Answer</w:t>
+      </w:r>
+      <w:r>
+        <w:rPr>
+          <w:color w:val="000000" w:themeColor="text1"/>
+        </w:rPr>
+        <w:t>. TODO</w:t>
       </w:r>
     </w:p>
     <w:p>
@@ -2955,6 +3958,26 @@
       <w:color w:val="0F4761" w:themeColor="accent1" w:themeShade="bf"/>
     </w:rPr>
   </w:style>
+  <w:style w:type="paragraph" w:styleId="MDPI31text">
+    <w:name w:val="MDPI_3.1_text"/>
+    <w:qFormat/>
+    <w:pPr>
+      <w:widowControl/>
+      <w:bidi w:val="0"/>
+      <w:snapToGrid w:val="false"/>
+      <w:spacing w:lineRule="atLeast" w:line="280" w:before="0" w:after="0"/>
+      <w:ind w:left="2608" w:firstLine="425"/>
+      <w:jc w:val="both"/>
+    </w:pPr>
+    <w:rPr>
+      <w:rFonts w:ascii="Palatino Linotype" w:hAnsi="Palatino Linotype" w:eastAsia="Times New Roman" w:cs=""/>
+      <w:color w:val="000000"/>
+      <w:kern w:val="2"/>
+      <w:sz w:val="24"/>
+      <w:szCs w:val="22"/>
+      <w:lang w:eastAsia="de-DE" w:bidi="en-US" w:val="en-US"/>
+    </w:rPr>
+  </w:style>
   <w:style w:type="numbering" w:styleId="NoList" w:default="1">
     <w:name w:val="No List"/>
     <w:uiPriority w:val="99"/>

</xml_diff>